<commit_message>
refs: update ng-aide-01#15 → #1 after umbrella migration to clean refactor repo
The NG-AIDE-01 umbrella migrated from the legacy chatbot-fork repo (now
ologos-corp/ng-chatbot-ref-01) into the clean-slate refactor repo that now
holds the ng-aide-01 name. Issue renumbered #15 → #1 on transfer; references
in the synthesis paper + ADR-EA-0011 updated accordingly. Docx regenerated.

Co-Authored-By: Claude Opus 4.7 (1M context) <noreply@anthropic.com>
</commit_message>
<xml_diff>
--- a/vision-strategy/analysis/mcp-integration/synthesis-paper-v0.2.docx
+++ b/vision-strategy/analysis/mcp-integration/synthesis-paper-v0.2.docx
@@ -633,7 +633,7 @@
                 <w:rPr>
                   <w:rStyle w:val="Hyperlink"/>
                 </w:rPr>
-                <w:t xml:space="preserve">ng-aide-01#15</w:t>
+                <w:t xml:space="preserve">ng-aide-01#1</w:t>
               </w:r>
             </w:hyperlink>
             <w:r>
@@ -12641,7 +12641,7 @@
           <w:rPr>
             <w:rStyle w:val="Hyperlink"/>
           </w:rPr>
-          <w:t xml:space="preserve">ng-aide-01#15</w:t>
+          <w:t xml:space="preserve">ng-aide-01#1</w:t>
         </w:r>
       </w:hyperlink>
       <w:r>

</xml_diff>